<commit_message>
Thịnh commit lab 4
</commit_message>
<xml_diff>
--- a/LAB4/11TMDT-LAB4_1150070040-NguyenPhuocThinh.docx
+++ b/LAB4/11TMDT-LAB4_1150070040-NguyenPhuocThinh.docx
@@ -12,6 +12,39 @@
       <w:r>
         <w:rPr>
           <w:rFonts w:ascii="Times New Roman" w:hAnsi="Times New Roman" w:cs="Times New Roman"/>
+          <w:b/>
+          <w:bCs/>
+          <w:sz w:val="26"/>
+        </w:rPr>
+        <w:t>BÁO CÁO THỰC HÀNH AN TOÀN HỆ THỐNG THÔNG TIN</w:t>
+      </w:r>
+      <w:r>
+        <w:rPr>
+          <w:rFonts w:ascii="Times New Roman" w:hAnsi="Times New Roman" w:cs="Times New Roman"/>
+          <w:sz w:val="26"/>
+        </w:rPr>
+        <w:br/>
+      </w:r>
+      <w:r>
+        <w:rPr>
+          <w:rFonts w:ascii="Times New Roman" w:hAnsi="Times New Roman" w:cs="Times New Roman"/>
+          <w:b/>
+          <w:bCs/>
+          <w:sz w:val="26"/>
+        </w:rPr>
+        <w:t>LAB 4 – KHẢO SÁT VÀ ĐÁNH GIÁ BỀ MẶT MẠNG BẰNG NMAP</w:t>
+      </w:r>
+    </w:p>
+    <w:p>
+      <w:pPr>
+        <w:rPr>
+          <w:rFonts w:ascii="Times New Roman" w:hAnsi="Times New Roman" w:cs="Times New Roman"/>
+          <w:sz w:val="26"/>
+        </w:rPr>
+      </w:pPr>
+      <w:r>
+        <w:rPr>
+          <w:rFonts w:ascii="Times New Roman" w:hAnsi="Times New Roman" w:cs="Times New Roman"/>
           <w:sz w:val="26"/>
         </w:rPr>
         <w:t>Họ và tên: Nguyễn Phước Thịnh</w:t>
@@ -64,42 +97,75 @@
       <w:r>
         <w:t xml:space="preserve"> </w:t>
       </w:r>
-      <w:r>
-        <w:rPr>
-          <w:rFonts w:ascii="Times New Roman" w:hAnsi="Times New Roman" w:cs="Times New Roman"/>
-          <w:sz w:val="26"/>
-        </w:rPr>
-        <w:t>https://youtu.be/NjXfHiKdLzA</w:t>
-      </w:r>
-    </w:p>
-    <w:p>
-      <w:pPr>
-        <w:rPr>
-          <w:rFonts w:ascii="Times New Roman" w:hAnsi="Times New Roman" w:cs="Times New Roman"/>
-          <w:sz w:val="26"/>
-        </w:rPr>
-      </w:pPr>
-      <w:r>
-        <w:rPr>
-          <w:rFonts w:ascii="Times New Roman" w:hAnsi="Times New Roman" w:cs="Times New Roman"/>
-          <w:sz w:val="26"/>
-        </w:rPr>
-        <w:t>BÀI BÁO CÁO LAB 4: KHẢO SÁT VÀ ĐÁNH GIÁ BỀ MẶT MẠNG BẰNG NMAP</w:t>
-      </w:r>
-    </w:p>
-    <w:p>
-      <w:pPr>
-        <w:rPr>
-          <w:rFonts w:ascii="Times New Roman" w:hAnsi="Times New Roman" w:cs="Times New Roman"/>
-          <w:sz w:val="26"/>
-        </w:rPr>
-      </w:pPr>
-      <w:r>
-        <w:rPr>
-          <w:rFonts w:ascii="Times New Roman" w:hAnsi="Times New Roman" w:cs="Times New Roman"/>
-          <w:sz w:val="26"/>
-        </w:rPr>
-        <w:t xml:space="preserve">CÂU HỎI PHÂN TÍCH VÀ BÀI TẬP BỔ SUNG </w:t>
+      <w:hyperlink r:id="rId5" w:history="1">
+        <w:r>
+          <w:rPr>
+            <w:rStyle w:val="Hyperlink"/>
+            <w:rFonts w:ascii="Times New Roman" w:hAnsi="Times New Roman" w:cs="Times New Roman"/>
+            <w:sz w:val="26"/>
+          </w:rPr>
+          <w:t>https://youtu.be/NjXfHiKdLzA</w:t>
+        </w:r>
+      </w:hyperlink>
+    </w:p>
+    <w:p>
+      <w:pPr>
+        <w:rPr>
+          <w:rFonts w:ascii="Times New Roman" w:hAnsi="Times New Roman" w:cs="Times New Roman"/>
+          <w:sz w:val="26"/>
+        </w:rPr>
+      </w:pPr>
+      <w:r>
+        <w:rPr>
+          <w:rFonts w:ascii="Times New Roman" w:hAnsi="Times New Roman" w:cs="Times New Roman"/>
+          <w:sz w:val="26"/>
+        </w:rPr>
+        <w:t>Nền tảng ảo hóa: VMware Workstation 17.x (Chế độ mạng cô lập Host-Only: 192.168.119.0/24).</w:t>
+      </w:r>
+    </w:p>
+    <w:p>
+      <w:pPr>
+        <w:rPr>
+          <w:rFonts w:ascii="Times New Roman" w:hAnsi="Times New Roman" w:cs="Times New Roman"/>
+          <w:sz w:val="26"/>
+        </w:rPr>
+      </w:pPr>
+      <w:r>
+        <w:rPr>
+          <w:rFonts w:ascii="Times New Roman" w:hAnsi="Times New Roman" w:cs="Times New Roman"/>
+          <w:sz w:val="26"/>
+        </w:rPr>
+        <w:t>Máy quét (Scanner): Kali Linux (User: nguyenphuocthinh, IP: 192.168.119.129, Phiên bản: Nmap 7.99).</w:t>
+      </w:r>
+    </w:p>
+    <w:p>
+      <w:pPr>
+        <w:rPr>
+          <w:rFonts w:ascii="Times New Roman" w:hAnsi="Times New Roman" w:cs="Times New Roman"/>
+          <w:sz w:val="26"/>
+        </w:rPr>
+      </w:pPr>
+      <w:r>
+        <w:rPr>
+          <w:rFonts w:ascii="Times New Roman" w:hAnsi="Times New Roman" w:cs="Times New Roman"/>
+          <w:sz w:val="26"/>
+        </w:rPr>
+        <w:t>Máy mục tiêu (Target): Metasploitable 2 (IP: 192.168.119.128, MAC: 00:0C:29:43:9B:41, Hệ điều hành: Linux Kernel 2.6.9 - 2.6.33).</w:t>
+      </w:r>
+    </w:p>
+    <w:p>
+      <w:pPr>
+        <w:rPr>
+          <w:rFonts w:ascii="Times New Roman" w:hAnsi="Times New Roman" w:cs="Times New Roman"/>
+          <w:sz w:val="26"/>
+        </w:rPr>
+      </w:pPr>
+      <w:r>
+        <w:rPr>
+          <w:rFonts w:ascii="Times New Roman" w:hAnsi="Times New Roman" w:cs="Times New Roman"/>
+          <w:sz w:val="26"/>
+        </w:rPr>
+        <w:t>Máy kiểm tra đối chiếu: Windows (Phiên bản Nmap 7.991 for Windows + Npcap).</w:t>
       </w:r>
     </w:p>
     <w:p>
@@ -160,7 +226,7 @@
                     <pic:cNvPicPr/>
                   </pic:nvPicPr>
                   <pic:blipFill>
-                    <a:blip r:embed="rId4" cstate="print">
+                    <a:blip r:embed="rId6" cstate="print">
                       <a:extLst>
                         <a:ext uri="{28A0092B-C50C-407E-A947-70E740481C1C}">
                           <a14:useLocalDpi xmlns:a14="http://schemas.microsoft.com/office/drawing/2010/main" val="0"/>
@@ -217,7 +283,7 @@
         </w:rPr>
         <w:lastRenderedPageBreak/>
         <w:drawing>
-          <wp:inline distT="0" distB="0" distL="0" distR="0" wp14:anchorId="2DE98B73" wp14:editId="24056DAC">
+          <wp:inline distT="0" distB="0" distL="0" distR="0" wp14:anchorId="2DE98B73" wp14:editId="529EC4B6">
             <wp:extent cx="5943600" cy="2939415"/>
             <wp:effectExtent l="0" t="0" r="0" b="0"/>
             <wp:docPr id="452383011" name="Picture 2" descr="A screen shot of a computer&#10;&#10;AI-generated content may be incorrect."/>
@@ -232,7 +298,7 @@
                     <pic:cNvPicPr/>
                   </pic:nvPicPr>
                   <pic:blipFill>
-                    <a:blip r:embed="rId5" cstate="print">
+                    <a:blip r:embed="rId7" cstate="print">
                       <a:extLst>
                         <a:ext uri="{28A0092B-C50C-407E-A947-70E740481C1C}">
                           <a14:useLocalDpi xmlns:a14="http://schemas.microsoft.com/office/drawing/2010/main" val="0"/>
@@ -303,7 +369,7 @@
                     <pic:cNvPicPr/>
                   </pic:nvPicPr>
                   <pic:blipFill>
-                    <a:blip r:embed="rId6" cstate="print">
+                    <a:blip r:embed="rId8" cstate="print">
                       <a:extLst>
                         <a:ext uri="{28A0092B-C50C-407E-A947-70E740481C1C}">
                           <a14:useLocalDpi xmlns:a14="http://schemas.microsoft.com/office/drawing/2010/main" val="0"/>
@@ -375,7 +441,7 @@
                     <pic:cNvPicPr/>
                   </pic:nvPicPr>
                   <pic:blipFill>
-                    <a:blip r:embed="rId7" cstate="print">
+                    <a:blip r:embed="rId9" cstate="print">
                       <a:extLst>
                         <a:ext uri="{28A0092B-C50C-407E-A947-70E740481C1C}">
                           <a14:useLocalDpi xmlns:a14="http://schemas.microsoft.com/office/drawing/2010/main" val="0"/>
@@ -446,7 +512,7 @@
                     <pic:cNvPicPr/>
                   </pic:nvPicPr>
                   <pic:blipFill>
-                    <a:blip r:embed="rId8" cstate="print">
+                    <a:blip r:embed="rId10" cstate="print">
                       <a:extLst>
                         <a:ext uri="{28A0092B-C50C-407E-A947-70E740481C1C}">
                           <a14:useLocalDpi xmlns:a14="http://schemas.microsoft.com/office/drawing/2010/main" val="0"/>
@@ -518,7 +584,7 @@
                     <pic:cNvPicPr/>
                   </pic:nvPicPr>
                   <pic:blipFill>
-                    <a:blip r:embed="rId9" cstate="print">
+                    <a:blip r:embed="rId11" cstate="print">
                       <a:extLst>
                         <a:ext uri="{28A0092B-C50C-407E-A947-70E740481C1C}">
                           <a14:useLocalDpi xmlns:a14="http://schemas.microsoft.com/office/drawing/2010/main" val="0"/>
@@ -589,7 +655,7 @@
                     <pic:cNvPicPr/>
                   </pic:nvPicPr>
                   <pic:blipFill>
-                    <a:blip r:embed="rId10" cstate="print">
+                    <a:blip r:embed="rId12" cstate="print">
                       <a:extLst>
                         <a:ext uri="{28A0092B-C50C-407E-A947-70E740481C1C}">
                           <a14:useLocalDpi xmlns:a14="http://schemas.microsoft.com/office/drawing/2010/main" val="0"/>
@@ -668,7 +734,7 @@
                     <pic:cNvPicPr/>
                   </pic:nvPicPr>
                   <pic:blipFill>
-                    <a:blip r:embed="rId11" cstate="print">
+                    <a:blip r:embed="rId13" cstate="print">
                       <a:extLst>
                         <a:ext uri="{28A0092B-C50C-407E-A947-70E740481C1C}">
                           <a14:useLocalDpi xmlns:a14="http://schemas.microsoft.com/office/drawing/2010/main" val="0"/>
@@ -2230,6 +2296,467 @@
     </w:sectPr>
   </w:body>
 </w:document>
+</file>
+
+<file path=word/numbering.xml><?xml version="1.0" encoding="utf-8"?>
+<w:numbering xmlns:wpc="http://schemas.microsoft.com/office/word/2010/wordprocessingCanvas" xmlns:cx="http://schemas.microsoft.com/office/drawing/2014/chartex" xmlns:cx1="http://schemas.microsoft.com/office/drawing/2015/9/8/chartex" xmlns:cx2="http://schemas.microsoft.com/office/drawing/2015/10/21/chartex" xmlns:cx3="http://schemas.microsoft.com/office/drawing/2016/5/9/chartex" xmlns:cx4="http://schemas.microsoft.com/office/drawing/2016/5/10/chartex" xmlns:cx5="http://schemas.microsoft.com/office/drawing/2016/5/11/chartex" xmlns:cx6="http://schemas.microsoft.com/office/drawing/2016/5/12/chartex" xmlns:cx7="http://schemas.microsoft.com/office/drawing/2016/5/13/chartex" xmlns:cx8="http://schemas.microsoft.com/office/drawing/2016/5/14/chartex" xmlns:mc="http://schemas.openxmlformats.org/markup-compatibility/2006" xmlns:aink="http://schemas.microsoft.com/office/drawing/2016/ink" xmlns:am3d="http://schemas.microsoft.com/office/drawing/2017/model3d" xmlns:o="urn:schemas-microsoft-com:office:office" xmlns:oel="http://schemas.microsoft.com/office/2019/extlst" xmlns:r="http://schemas.openxmlformats.org/officeDocument/2006/relationships" xmlns:m="http://schemas.openxmlformats.org/officeDocument/2006/math" xmlns:v="urn:schemas-microsoft-com:vml" xmlns:wp14="http://schemas.microsoft.com/office/word/2010/wordprocessingDrawing" xmlns:wp="http://schemas.openxmlformats.org/drawingml/2006/wordprocessingDrawing" xmlns:w10="urn:schemas-microsoft-com:office:word" xmlns:w="http://schemas.openxmlformats.org/wordprocessingml/2006/main" xmlns:w14="http://schemas.microsoft.com/office/word/2010/wordml" xmlns:w15="http://schemas.microsoft.com/office/word/2012/wordml" xmlns:w16cex="http://schemas.microsoft.com/office/word/2018/wordml/cex" xmlns:w16cid="http://schemas.microsoft.com/office/word/2016/wordml/cid" xmlns:w16="http://schemas.microsoft.com/office/word/2018/wordml" xmlns:w16du="http://schemas.microsoft.com/office/word/2023/wordml/word16du" xmlns:w16sdtdh="http://schemas.microsoft.com/office/word/2020/wordml/sdtdatahash" xmlns:w16sdtfl="http://schemas.microsoft.com/office/word/2024/wordml/sdtformatlock" xmlns:w16se="http://schemas.microsoft.com/office/word/2015/wordml/symex" xmlns:wpg="http://schemas.microsoft.com/office/word/2010/wordprocessingGroup" xmlns:wpi="http://schemas.microsoft.com/office/word/2010/wordprocessingInk" xmlns:wne="http://schemas.microsoft.com/office/word/2006/wordml" xmlns:wps="http://schemas.microsoft.com/office/word/2010/wordprocessingShape" mc:Ignorable="w14 w15 w16se w16cid w16 w16cex w16sdtdh w16sdtfl w16du wp14">
+  <w:abstractNum w:abstractNumId="0" w15:restartNumberingAfterBreak="0">
+    <w:nsid w:val="0BFD23FD"/>
+    <w:multiLevelType w:val="multilevel"/>
+    <w:tmpl w:val="CF5EEF40"/>
+    <w:lvl w:ilvl="0">
+      <w:start w:val="1"/>
+      <w:numFmt w:val="bullet"/>
+      <w:lvlText w:val=""/>
+      <w:lvlJc w:val="left"/>
+      <w:pPr>
+        <w:tabs>
+          <w:tab w:val="num" w:pos="720"/>
+        </w:tabs>
+        <w:ind w:left="720" w:hanging="360"/>
+      </w:pPr>
+      <w:rPr>
+        <w:rFonts w:ascii="Symbol" w:hAnsi="Symbol" w:hint="default"/>
+        <w:sz w:val="20"/>
+      </w:rPr>
+    </w:lvl>
+    <w:lvl w:ilvl="1" w:tentative="1">
+      <w:start w:val="1"/>
+      <w:numFmt w:val="bullet"/>
+      <w:lvlText w:val=""/>
+      <w:lvlJc w:val="left"/>
+      <w:pPr>
+        <w:tabs>
+          <w:tab w:val="num" w:pos="1440"/>
+        </w:tabs>
+        <w:ind w:left="1440" w:hanging="360"/>
+      </w:pPr>
+      <w:rPr>
+        <w:rFonts w:ascii="Symbol" w:hAnsi="Symbol" w:hint="default"/>
+        <w:sz w:val="20"/>
+      </w:rPr>
+    </w:lvl>
+    <w:lvl w:ilvl="2" w:tentative="1">
+      <w:start w:val="1"/>
+      <w:numFmt w:val="bullet"/>
+      <w:lvlText w:val=""/>
+      <w:lvlJc w:val="left"/>
+      <w:pPr>
+        <w:tabs>
+          <w:tab w:val="num" w:pos="2160"/>
+        </w:tabs>
+        <w:ind w:left="2160" w:hanging="360"/>
+      </w:pPr>
+      <w:rPr>
+        <w:rFonts w:ascii="Symbol" w:hAnsi="Symbol" w:hint="default"/>
+        <w:sz w:val="20"/>
+      </w:rPr>
+    </w:lvl>
+    <w:lvl w:ilvl="3" w:tentative="1">
+      <w:start w:val="1"/>
+      <w:numFmt w:val="bullet"/>
+      <w:lvlText w:val=""/>
+      <w:lvlJc w:val="left"/>
+      <w:pPr>
+        <w:tabs>
+          <w:tab w:val="num" w:pos="2880"/>
+        </w:tabs>
+        <w:ind w:left="2880" w:hanging="360"/>
+      </w:pPr>
+      <w:rPr>
+        <w:rFonts w:ascii="Symbol" w:hAnsi="Symbol" w:hint="default"/>
+        <w:sz w:val="20"/>
+      </w:rPr>
+    </w:lvl>
+    <w:lvl w:ilvl="4" w:tentative="1">
+      <w:start w:val="1"/>
+      <w:numFmt w:val="bullet"/>
+      <w:lvlText w:val=""/>
+      <w:lvlJc w:val="left"/>
+      <w:pPr>
+        <w:tabs>
+          <w:tab w:val="num" w:pos="3600"/>
+        </w:tabs>
+        <w:ind w:left="3600" w:hanging="360"/>
+      </w:pPr>
+      <w:rPr>
+        <w:rFonts w:ascii="Symbol" w:hAnsi="Symbol" w:hint="default"/>
+        <w:sz w:val="20"/>
+      </w:rPr>
+    </w:lvl>
+    <w:lvl w:ilvl="5" w:tentative="1">
+      <w:start w:val="1"/>
+      <w:numFmt w:val="bullet"/>
+      <w:lvlText w:val=""/>
+      <w:lvlJc w:val="left"/>
+      <w:pPr>
+        <w:tabs>
+          <w:tab w:val="num" w:pos="4320"/>
+        </w:tabs>
+        <w:ind w:left="4320" w:hanging="360"/>
+      </w:pPr>
+      <w:rPr>
+        <w:rFonts w:ascii="Symbol" w:hAnsi="Symbol" w:hint="default"/>
+        <w:sz w:val="20"/>
+      </w:rPr>
+    </w:lvl>
+    <w:lvl w:ilvl="6" w:tentative="1">
+      <w:start w:val="1"/>
+      <w:numFmt w:val="bullet"/>
+      <w:lvlText w:val=""/>
+      <w:lvlJc w:val="left"/>
+      <w:pPr>
+        <w:tabs>
+          <w:tab w:val="num" w:pos="5040"/>
+        </w:tabs>
+        <w:ind w:left="5040" w:hanging="360"/>
+      </w:pPr>
+      <w:rPr>
+        <w:rFonts w:ascii="Symbol" w:hAnsi="Symbol" w:hint="default"/>
+        <w:sz w:val="20"/>
+      </w:rPr>
+    </w:lvl>
+    <w:lvl w:ilvl="7" w:tentative="1">
+      <w:start w:val="1"/>
+      <w:numFmt w:val="bullet"/>
+      <w:lvlText w:val=""/>
+      <w:lvlJc w:val="left"/>
+      <w:pPr>
+        <w:tabs>
+          <w:tab w:val="num" w:pos="5760"/>
+        </w:tabs>
+        <w:ind w:left="5760" w:hanging="360"/>
+      </w:pPr>
+      <w:rPr>
+        <w:rFonts w:ascii="Symbol" w:hAnsi="Symbol" w:hint="default"/>
+        <w:sz w:val="20"/>
+      </w:rPr>
+    </w:lvl>
+    <w:lvl w:ilvl="8" w:tentative="1">
+      <w:start w:val="1"/>
+      <w:numFmt w:val="bullet"/>
+      <w:lvlText w:val=""/>
+      <w:lvlJc w:val="left"/>
+      <w:pPr>
+        <w:tabs>
+          <w:tab w:val="num" w:pos="6480"/>
+        </w:tabs>
+        <w:ind w:left="6480" w:hanging="360"/>
+      </w:pPr>
+      <w:rPr>
+        <w:rFonts w:ascii="Symbol" w:hAnsi="Symbol" w:hint="default"/>
+        <w:sz w:val="20"/>
+      </w:rPr>
+    </w:lvl>
+  </w:abstractNum>
+  <w:abstractNum w:abstractNumId="1" w15:restartNumberingAfterBreak="0">
+    <w:nsid w:val="132D5EE9"/>
+    <w:multiLevelType w:val="multilevel"/>
+    <w:tmpl w:val="9D9C1570"/>
+    <w:lvl w:ilvl="0">
+      <w:start w:val="1"/>
+      <w:numFmt w:val="bullet"/>
+      <w:lvlText w:val=""/>
+      <w:lvlJc w:val="left"/>
+      <w:pPr>
+        <w:tabs>
+          <w:tab w:val="num" w:pos="720"/>
+        </w:tabs>
+        <w:ind w:left="720" w:hanging="360"/>
+      </w:pPr>
+      <w:rPr>
+        <w:rFonts w:ascii="Symbol" w:hAnsi="Symbol" w:hint="default"/>
+        <w:sz w:val="20"/>
+      </w:rPr>
+    </w:lvl>
+    <w:lvl w:ilvl="1" w:tentative="1">
+      <w:start w:val="1"/>
+      <w:numFmt w:val="bullet"/>
+      <w:lvlText w:val=""/>
+      <w:lvlJc w:val="left"/>
+      <w:pPr>
+        <w:tabs>
+          <w:tab w:val="num" w:pos="1440"/>
+        </w:tabs>
+        <w:ind w:left="1440" w:hanging="360"/>
+      </w:pPr>
+      <w:rPr>
+        <w:rFonts w:ascii="Symbol" w:hAnsi="Symbol" w:hint="default"/>
+        <w:sz w:val="20"/>
+      </w:rPr>
+    </w:lvl>
+    <w:lvl w:ilvl="2" w:tentative="1">
+      <w:start w:val="1"/>
+      <w:numFmt w:val="bullet"/>
+      <w:lvlText w:val=""/>
+      <w:lvlJc w:val="left"/>
+      <w:pPr>
+        <w:tabs>
+          <w:tab w:val="num" w:pos="2160"/>
+        </w:tabs>
+        <w:ind w:left="2160" w:hanging="360"/>
+      </w:pPr>
+      <w:rPr>
+        <w:rFonts w:ascii="Symbol" w:hAnsi="Symbol" w:hint="default"/>
+        <w:sz w:val="20"/>
+      </w:rPr>
+    </w:lvl>
+    <w:lvl w:ilvl="3" w:tentative="1">
+      <w:start w:val="1"/>
+      <w:numFmt w:val="bullet"/>
+      <w:lvlText w:val=""/>
+      <w:lvlJc w:val="left"/>
+      <w:pPr>
+        <w:tabs>
+          <w:tab w:val="num" w:pos="2880"/>
+        </w:tabs>
+        <w:ind w:left="2880" w:hanging="360"/>
+      </w:pPr>
+      <w:rPr>
+        <w:rFonts w:ascii="Symbol" w:hAnsi="Symbol" w:hint="default"/>
+        <w:sz w:val="20"/>
+      </w:rPr>
+    </w:lvl>
+    <w:lvl w:ilvl="4" w:tentative="1">
+      <w:start w:val="1"/>
+      <w:numFmt w:val="bullet"/>
+      <w:lvlText w:val=""/>
+      <w:lvlJc w:val="left"/>
+      <w:pPr>
+        <w:tabs>
+          <w:tab w:val="num" w:pos="3600"/>
+        </w:tabs>
+        <w:ind w:left="3600" w:hanging="360"/>
+      </w:pPr>
+      <w:rPr>
+        <w:rFonts w:ascii="Symbol" w:hAnsi="Symbol" w:hint="default"/>
+        <w:sz w:val="20"/>
+      </w:rPr>
+    </w:lvl>
+    <w:lvl w:ilvl="5" w:tentative="1">
+      <w:start w:val="1"/>
+      <w:numFmt w:val="bullet"/>
+      <w:lvlText w:val=""/>
+      <w:lvlJc w:val="left"/>
+      <w:pPr>
+        <w:tabs>
+          <w:tab w:val="num" w:pos="4320"/>
+        </w:tabs>
+        <w:ind w:left="4320" w:hanging="360"/>
+      </w:pPr>
+      <w:rPr>
+        <w:rFonts w:ascii="Symbol" w:hAnsi="Symbol" w:hint="default"/>
+        <w:sz w:val="20"/>
+      </w:rPr>
+    </w:lvl>
+    <w:lvl w:ilvl="6" w:tentative="1">
+      <w:start w:val="1"/>
+      <w:numFmt w:val="bullet"/>
+      <w:lvlText w:val=""/>
+      <w:lvlJc w:val="left"/>
+      <w:pPr>
+        <w:tabs>
+          <w:tab w:val="num" w:pos="5040"/>
+        </w:tabs>
+        <w:ind w:left="5040" w:hanging="360"/>
+      </w:pPr>
+      <w:rPr>
+        <w:rFonts w:ascii="Symbol" w:hAnsi="Symbol" w:hint="default"/>
+        <w:sz w:val="20"/>
+      </w:rPr>
+    </w:lvl>
+    <w:lvl w:ilvl="7" w:tentative="1">
+      <w:start w:val="1"/>
+      <w:numFmt w:val="bullet"/>
+      <w:lvlText w:val=""/>
+      <w:lvlJc w:val="left"/>
+      <w:pPr>
+        <w:tabs>
+          <w:tab w:val="num" w:pos="5760"/>
+        </w:tabs>
+        <w:ind w:left="5760" w:hanging="360"/>
+      </w:pPr>
+      <w:rPr>
+        <w:rFonts w:ascii="Symbol" w:hAnsi="Symbol" w:hint="default"/>
+        <w:sz w:val="20"/>
+      </w:rPr>
+    </w:lvl>
+    <w:lvl w:ilvl="8" w:tentative="1">
+      <w:start w:val="1"/>
+      <w:numFmt w:val="bullet"/>
+      <w:lvlText w:val=""/>
+      <w:lvlJc w:val="left"/>
+      <w:pPr>
+        <w:tabs>
+          <w:tab w:val="num" w:pos="6480"/>
+        </w:tabs>
+        <w:ind w:left="6480" w:hanging="360"/>
+      </w:pPr>
+      <w:rPr>
+        <w:rFonts w:ascii="Symbol" w:hAnsi="Symbol" w:hint="default"/>
+        <w:sz w:val="20"/>
+      </w:rPr>
+    </w:lvl>
+  </w:abstractNum>
+  <w:abstractNum w:abstractNumId="2" w15:restartNumberingAfterBreak="0">
+    <w:nsid w:val="61570734"/>
+    <w:multiLevelType w:val="multilevel"/>
+    <w:tmpl w:val="FFA64D2C"/>
+    <w:lvl w:ilvl="0">
+      <w:start w:val="1"/>
+      <w:numFmt w:val="bullet"/>
+      <w:lvlText w:val=""/>
+      <w:lvlJc w:val="left"/>
+      <w:pPr>
+        <w:tabs>
+          <w:tab w:val="num" w:pos="720"/>
+        </w:tabs>
+        <w:ind w:left="720" w:hanging="360"/>
+      </w:pPr>
+      <w:rPr>
+        <w:rFonts w:ascii="Symbol" w:hAnsi="Symbol" w:hint="default"/>
+        <w:sz w:val="20"/>
+      </w:rPr>
+    </w:lvl>
+    <w:lvl w:ilvl="1" w:tentative="1">
+      <w:start w:val="1"/>
+      <w:numFmt w:val="bullet"/>
+      <w:lvlText w:val=""/>
+      <w:lvlJc w:val="left"/>
+      <w:pPr>
+        <w:tabs>
+          <w:tab w:val="num" w:pos="1440"/>
+        </w:tabs>
+        <w:ind w:left="1440" w:hanging="360"/>
+      </w:pPr>
+      <w:rPr>
+        <w:rFonts w:ascii="Symbol" w:hAnsi="Symbol" w:hint="default"/>
+        <w:sz w:val="20"/>
+      </w:rPr>
+    </w:lvl>
+    <w:lvl w:ilvl="2" w:tentative="1">
+      <w:start w:val="1"/>
+      <w:numFmt w:val="bullet"/>
+      <w:lvlText w:val=""/>
+      <w:lvlJc w:val="left"/>
+      <w:pPr>
+        <w:tabs>
+          <w:tab w:val="num" w:pos="2160"/>
+        </w:tabs>
+        <w:ind w:left="2160" w:hanging="360"/>
+      </w:pPr>
+      <w:rPr>
+        <w:rFonts w:ascii="Symbol" w:hAnsi="Symbol" w:hint="default"/>
+        <w:sz w:val="20"/>
+      </w:rPr>
+    </w:lvl>
+    <w:lvl w:ilvl="3" w:tentative="1">
+      <w:start w:val="1"/>
+      <w:numFmt w:val="bullet"/>
+      <w:lvlText w:val=""/>
+      <w:lvlJc w:val="left"/>
+      <w:pPr>
+        <w:tabs>
+          <w:tab w:val="num" w:pos="2880"/>
+        </w:tabs>
+        <w:ind w:left="2880" w:hanging="360"/>
+      </w:pPr>
+      <w:rPr>
+        <w:rFonts w:ascii="Symbol" w:hAnsi="Symbol" w:hint="default"/>
+        <w:sz w:val="20"/>
+      </w:rPr>
+    </w:lvl>
+    <w:lvl w:ilvl="4" w:tentative="1">
+      <w:start w:val="1"/>
+      <w:numFmt w:val="bullet"/>
+      <w:lvlText w:val=""/>
+      <w:lvlJc w:val="left"/>
+      <w:pPr>
+        <w:tabs>
+          <w:tab w:val="num" w:pos="3600"/>
+        </w:tabs>
+        <w:ind w:left="3600" w:hanging="360"/>
+      </w:pPr>
+      <w:rPr>
+        <w:rFonts w:ascii="Symbol" w:hAnsi="Symbol" w:hint="default"/>
+        <w:sz w:val="20"/>
+      </w:rPr>
+    </w:lvl>
+    <w:lvl w:ilvl="5" w:tentative="1">
+      <w:start w:val="1"/>
+      <w:numFmt w:val="bullet"/>
+      <w:lvlText w:val=""/>
+      <w:lvlJc w:val="left"/>
+      <w:pPr>
+        <w:tabs>
+          <w:tab w:val="num" w:pos="4320"/>
+        </w:tabs>
+        <w:ind w:left="4320" w:hanging="360"/>
+      </w:pPr>
+      <w:rPr>
+        <w:rFonts w:ascii="Symbol" w:hAnsi="Symbol" w:hint="default"/>
+        <w:sz w:val="20"/>
+      </w:rPr>
+    </w:lvl>
+    <w:lvl w:ilvl="6" w:tentative="1">
+      <w:start w:val="1"/>
+      <w:numFmt w:val="bullet"/>
+      <w:lvlText w:val=""/>
+      <w:lvlJc w:val="left"/>
+      <w:pPr>
+        <w:tabs>
+          <w:tab w:val="num" w:pos="5040"/>
+        </w:tabs>
+        <w:ind w:left="5040" w:hanging="360"/>
+      </w:pPr>
+      <w:rPr>
+        <w:rFonts w:ascii="Symbol" w:hAnsi="Symbol" w:hint="default"/>
+        <w:sz w:val="20"/>
+      </w:rPr>
+    </w:lvl>
+    <w:lvl w:ilvl="7" w:tentative="1">
+      <w:start w:val="1"/>
+      <w:numFmt w:val="bullet"/>
+      <w:lvlText w:val=""/>
+      <w:lvlJc w:val="left"/>
+      <w:pPr>
+        <w:tabs>
+          <w:tab w:val="num" w:pos="5760"/>
+        </w:tabs>
+        <w:ind w:left="5760" w:hanging="360"/>
+      </w:pPr>
+      <w:rPr>
+        <w:rFonts w:ascii="Symbol" w:hAnsi="Symbol" w:hint="default"/>
+        <w:sz w:val="20"/>
+      </w:rPr>
+    </w:lvl>
+    <w:lvl w:ilvl="8" w:tentative="1">
+      <w:start w:val="1"/>
+      <w:numFmt w:val="bullet"/>
+      <w:lvlText w:val=""/>
+      <w:lvlJc w:val="left"/>
+      <w:pPr>
+        <w:tabs>
+          <w:tab w:val="num" w:pos="6480"/>
+        </w:tabs>
+        <w:ind w:left="6480" w:hanging="360"/>
+      </w:pPr>
+      <w:rPr>
+        <w:rFonts w:ascii="Symbol" w:hAnsi="Symbol" w:hint="default"/>
+        <w:sz w:val="20"/>
+      </w:rPr>
+    </w:lvl>
+  </w:abstractNum>
+  <w:num w:numId="1" w16cid:durableId="422143642">
+    <w:abstractNumId w:val="0"/>
+  </w:num>
+  <w:num w:numId="2" w16cid:durableId="244413305">
+    <w:abstractNumId w:val="2"/>
+  </w:num>
+  <w:num w:numId="3" w16cid:durableId="1723288091">
+    <w:abstractNumId w:val="1"/>
+  </w:num>
+</w:numbering>
 </file>
 
 <file path=word/styles.xml><?xml version="1.0" encoding="utf-8"?>
@@ -2835,7 +3362,6 @@
   <w:style w:type="character" w:default="1" w:styleId="DefaultParagraphFont">
     <w:name w:val="Default Paragraph Font"/>
     <w:uiPriority w:val="1"/>
-    <w:semiHidden/>
     <w:unhideWhenUsed/>
   </w:style>
   <w:style w:type="table" w:default="1" w:styleId="TableNormal">
@@ -3149,6 +3675,29 @@
       <w:spacing w:val="5"/>
     </w:rPr>
   </w:style>
+  <w:style w:type="character" w:styleId="Hyperlink">
+    <w:name w:val="Hyperlink"/>
+    <w:basedOn w:val="DefaultParagraphFont"/>
+    <w:uiPriority w:val="99"/>
+    <w:unhideWhenUsed/>
+    <w:rsid w:val="004B5B56"/>
+    <w:rPr>
+      <w:color w:val="467886" w:themeColor="hyperlink"/>
+      <w:u w:val="single"/>
+    </w:rPr>
+  </w:style>
+  <w:style w:type="character" w:styleId="UnresolvedMention">
+    <w:name w:val="Unresolved Mention"/>
+    <w:basedOn w:val="DefaultParagraphFont"/>
+    <w:uiPriority w:val="99"/>
+    <w:semiHidden/>
+    <w:unhideWhenUsed/>
+    <w:rsid w:val="004B5B56"/>
+    <w:rPr>
+      <w:color w:val="605E5C"/>
+      <w:shd w:val="clear" w:color="auto" w:fill="E1DFDD"/>
+    </w:rPr>
+  </w:style>
 </w:styles>
 </file>
 

</xml_diff>